<commit_message>
UPDATE: README update (and word)
</commit_message>
<xml_diff>
--- a/tz_url_shortener.docx
+++ b/tz_url_shortener.docx
@@ -81,18 +81,28 @@
         <w:pBdr/>
         <w:spacing w:after="60" w:line="276" w:lineRule="auto"/>
         <w:ind/>
-        <w:rPr/>
+        <w:rPr>
+          <w:highlight w:val="green"/>
+        </w:rPr>
       </w:pPr>
       <w:r>
         <w:rPr>
           <w:b/>
+          <w:highlight w:val="green"/>
         </w:rPr>
         <w:t xml:space="preserve">Backend: </w:t>
       </w:r>
       <w:r>
+        <w:rPr>
+          <w:highlight w:val="green"/>
+        </w:rPr>
         <w:t xml:space="preserve"> Laravel 11+ (REST API, Масштабируемая архитектура, Eloquent ORM).</w:t>
       </w:r>
-      <w:r/>
+      <w:r>
+        <w:rPr>
+          <w:highlight w:val="green"/>
+        </w:rPr>
+      </w:r>
     </w:p>
     <w:p>
       <w:pPr>
@@ -100,18 +110,28 @@
         <w:pBdr/>
         <w:spacing w:after="60" w:line="276" w:lineRule="auto"/>
         <w:ind/>
-        <w:rPr/>
+        <w:rPr>
+          <w:highlight w:val="green"/>
+        </w:rPr>
       </w:pPr>
       <w:r>
         <w:rPr>
           <w:b/>
+          <w:highlight w:val="green"/>
         </w:rPr>
         <w:t xml:space="preserve">Frontend: </w:t>
       </w:r>
       <w:r>
+        <w:rPr>
+          <w:highlight w:val="green"/>
+        </w:rPr>
         <w:t xml:space="preserve"> Vue 3 (Composition API, Script Setup), Pinia (Управление состоянием), Vue Router.</w:t>
       </w:r>
-      <w:r/>
+      <w:r>
+        <w:rPr>
+          <w:highlight w:val="green"/>
+        </w:rPr>
+      </w:r>
     </w:p>
     <w:p>
       <w:pPr>
@@ -119,18 +139,28 @@
         <w:pBdr/>
         <w:spacing w:after="60" w:line="276" w:lineRule="auto"/>
         <w:ind/>
-        <w:rPr/>
+        <w:rPr>
+          <w:highlight w:val="green"/>
+        </w:rPr>
       </w:pPr>
       <w:r>
         <w:rPr>
           <w:b/>
+          <w:highlight w:val="green"/>
         </w:rPr>
         <w:t xml:space="preserve">Стилизация: </w:t>
       </w:r>
       <w:r>
+        <w:rPr>
+          <w:highlight w:val="green"/>
+        </w:rPr>
         <w:t xml:space="preserve"> Tailwind CSS (Адаптивный и современный UI/UX).</w:t>
       </w:r>
-      <w:r/>
+      <w:r>
+        <w:rPr>
+          <w:highlight w:val="green"/>
+        </w:rPr>
+      </w:r>
     </w:p>
     <w:p>
       <w:pPr>
@@ -138,18 +168,28 @@
         <w:pBdr/>
         <w:spacing w:after="60" w:line="276" w:lineRule="auto"/>
         <w:ind/>
-        <w:rPr/>
+        <w:rPr>
+          <w:highlight w:val="green"/>
+        </w:rPr>
       </w:pPr>
       <w:r>
         <w:rPr>
           <w:b/>
+          <w:highlight w:val="green"/>
         </w:rPr>
         <w:t xml:space="preserve">База данных: </w:t>
       </w:r>
       <w:r>
+        <w:rPr>
+          <w:highlight w:val="green"/>
+        </w:rPr>
         <w:t xml:space="preserve"> PostgreSQL или MySQL (Реляционная база данных для надежного хранения данных).</w:t>
       </w:r>
-      <w:r/>
+      <w:r>
+        <w:rPr>
+          <w:highlight w:val="green"/>
+        </w:rPr>
+      </w:r>
     </w:p>
     <w:p>
       <w:pPr>
@@ -157,18 +197,28 @@
         <w:pBdr/>
         <w:spacing w:after="60" w:line="276" w:lineRule="auto"/>
         <w:ind/>
-        <w:rPr/>
+        <w:rPr>
+          <w:highlight w:val="green"/>
+        </w:rPr>
       </w:pPr>
       <w:r>
         <w:rPr>
           <w:b/>
+          <w:highlight w:val="green"/>
         </w:rPr>
         <w:t xml:space="preserve">Кэш и очереди: </w:t>
       </w:r>
       <w:r>
+        <w:rPr>
+          <w:highlight w:val="green"/>
+        </w:rPr>
         <w:t xml:space="preserve"> Redis (Кэширование редиректов, брокер очередей для асинхронной аналитики).</w:t>
       </w:r>
-      <w:r/>
+      <w:r>
+        <w:rPr>
+          <w:highlight w:val="green"/>
+        </w:rPr>
+      </w:r>
     </w:p>
     <w:p>
       <w:pPr>
@@ -176,18 +226,28 @@
         <w:pBdr/>
         <w:spacing w:after="60" w:line="276" w:lineRule="auto"/>
         <w:ind/>
-        <w:rPr/>
+        <w:rPr>
+          <w:highlight w:val="green"/>
+        </w:rPr>
       </w:pPr>
       <w:r>
         <w:rPr>
           <w:b/>
+          <w:highlight w:val="green"/>
         </w:rPr>
         <w:t xml:space="preserve">Окружение: </w:t>
       </w:r>
       <w:r>
+        <w:rPr>
+          <w:highlight w:val="green"/>
+        </w:rPr>
         <w:t xml:space="preserve"> Laravel Sail / Docker (Контейнеризация среды разработки для быстрой развертки).</w:t>
       </w:r>
-      <w:r/>
+      <w:r>
+        <w:rPr>
+          <w:highlight w:val="green"/>
+        </w:rPr>
+      </w:r>
     </w:p>
     <w:p>
       <w:pPr>
@@ -195,18 +255,28 @@
         <w:pBdr/>
         <w:spacing w:after="60" w:line="276" w:lineRule="auto"/>
         <w:ind/>
-        <w:rPr/>
+        <w:rPr>
+          <w:highlight w:val="green"/>
+        </w:rPr>
       </w:pPr>
       <w:r>
         <w:rPr>
           <w:b/>
+          <w:highlight w:val="green"/>
         </w:rPr>
         <w:t xml:space="preserve">Тестирование: </w:t>
       </w:r>
       <w:r>
+        <w:rPr>
+          <w:highlight w:val="green"/>
+        </w:rPr>
         <w:t xml:space="preserve"> Pest или PHPUnit (Автоматизированное Feature и Unit тестирование).</w:t>
       </w:r>
-      <w:r/>
+      <w:r>
+        <w:rPr>
+          <w:highlight w:val="green"/>
+        </w:rPr>
+      </w:r>
     </w:p>
     <w:p>
       <w:pPr>
@@ -670,18 +740,28 @@
         <w:pBdr/>
         <w:spacing w:after="60" w:line="276" w:lineRule="auto"/>
         <w:ind/>
-        <w:rPr/>
+        <w:rPr>
+          <w:highlight w:val="green"/>
+        </w:rPr>
       </w:pPr>
       <w:r>
         <w:rPr>
           <w:b/>
+          <w:highlight w:val="green"/>
         </w:rPr>
         <w:t xml:space="preserve">Алгоритм генерации:</w:t>
       </w:r>
       <w:r>
+        <w:rPr>
+          <w:highlight w:val="green"/>
+        </w:rPr>
         <w:t xml:space="preserve"> Использование алгоритма Base62 для преобразования автоинкрементного ID в короткий уникальный хэш (например, 7aB3dE).</w:t>
       </w:r>
-      <w:r/>
+      <w:r>
+        <w:rPr>
+          <w:highlight w:val="green"/>
+        </w:rPr>
+      </w:r>
     </w:p>
     <w:p>
       <w:pPr>

</xml_diff>

<commit_message>
FINAL: backend final commit. Create swagger, tests, jobs, queue, etc.
</commit_message>
<xml_diff>
--- a/tz_url_shortener.docx
+++ b/tz_url_shortener.docx
@@ -702,6 +702,11 @@
           <w:highlight w:val="green"/>
         </w:rPr>
       </w:r>
+      <w:r>
+        <w:rPr>
+          <w:highlight w:val="green"/>
+        </w:rPr>
+      </w:r>
     </w:p>
     <w:p>
       <w:pPr>
@@ -731,6 +736,11 @@
           <w:highlight w:val="green"/>
         </w:rPr>
       </w:r>
+      <w:r>
+        <w:rPr>
+          <w:highlight w:val="green"/>
+        </w:rPr>
+      </w:r>
     </w:p>
     <w:p>
       <w:pPr>
@@ -760,6 +770,11 @@
           <w:highlight w:val="green"/>
         </w:rPr>
       </w:r>
+      <w:r>
+        <w:rPr>
+          <w:highlight w:val="green"/>
+        </w:rPr>
+      </w:r>
     </w:p>
     <w:p>
       <w:pPr>
@@ -789,6 +804,11 @@
           <w:highlight w:val="green"/>
         </w:rPr>
       </w:r>
+      <w:r>
+        <w:rPr>
+          <w:highlight w:val="green"/>
+        </w:rPr>
+      </w:r>
     </w:p>
     <w:p>
       <w:pPr>
@@ -812,6 +832,11 @@
           <w:highlight w:val="green"/>
         </w:rPr>
         <w:t xml:space="preserve"> Классификация трафика (Desktop, Mobile, Tablet) на основе парсинга User-Agent.</w:t>
+      </w:r>
+      <w:r>
+        <w:rPr>
+          <w:highlight w:val="green"/>
+        </w:rPr>
       </w:r>
       <w:r>
         <w:rPr>
@@ -912,18 +937,28 @@
         <w:pBdr/>
         <w:spacing w:after="60" w:line="276" w:lineRule="auto"/>
         <w:ind/>
-        <w:rPr/>
+        <w:rPr>
+          <w:highlight w:val="green"/>
+        </w:rPr>
       </w:pPr>
       <w:r>
         <w:rPr>
           <w:b/>
+          <w:highlight w:val="green"/>
         </w:rPr>
         <w:t xml:space="preserve">Очереди задач:</w:t>
       </w:r>
       <w:r>
+        <w:rPr>
+          <w:highlight w:val="green"/>
+        </w:rPr>
         <w:t xml:space="preserve"> Обработка клика и запись метрик выполняется асинхронно через Laravel Queues (Redis). Редирект пользователя происходит мгновенно.</w:t>
       </w:r>
-      <w:r/>
+      <w:r>
+        <w:rPr>
+          <w:highlight w:val="green"/>
+        </w:rPr>
+      </w:r>
     </w:p>
     <w:p>
       <w:pPr>
@@ -950,18 +985,28 @@
         <w:pBdr/>
         <w:spacing w:after="60" w:line="276" w:lineRule="auto"/>
         <w:ind/>
-        <w:rPr/>
+        <w:rPr>
+          <w:highlight w:val="green"/>
+        </w:rPr>
       </w:pPr>
       <w:r>
         <w:rPr>
           <w:b/>
+          <w:highlight w:val="green"/>
         </w:rPr>
         <w:t xml:space="preserve">Управление токенами:</w:t>
       </w:r>
       <w:r>
+        <w:rPr>
+          <w:highlight w:val="green"/>
+        </w:rPr>
         <w:t xml:space="preserve"> Генерация и отзыв персональных API-токенов в профиле пользователя (Laravel Sanctum).</w:t>
       </w:r>
-      <w:r/>
+      <w:r>
+        <w:rPr>
+          <w:highlight w:val="green"/>
+        </w:rPr>
+      </w:r>
     </w:p>
     <w:p>
       <w:pPr>
@@ -969,18 +1014,28 @@
         <w:pBdr/>
         <w:spacing w:after="60" w:line="276" w:lineRule="auto"/>
         <w:ind/>
-        <w:rPr/>
+        <w:rPr>
+          <w:highlight w:val="green"/>
+        </w:rPr>
       </w:pPr>
       <w:r>
         <w:rPr>
           <w:b/>
+          <w:highlight w:val="green"/>
         </w:rPr>
         <w:t xml:space="preserve">Интерфейсы:</w:t>
       </w:r>
       <w:r>
+        <w:rPr>
+          <w:highlight w:val="green"/>
+        </w:rPr>
         <w:t xml:space="preserve"> Эндпоинты для программного создания ссылок и удаленного получения агрегированной статистики.</w:t>
       </w:r>
-      <w:r/>
+      <w:r>
+        <w:rPr>
+          <w:highlight w:val="green"/>
+        </w:rPr>
+      </w:r>
     </w:p>
     <w:p>
       <w:pPr>
@@ -988,18 +1043,28 @@
         <w:pBdr/>
         <w:spacing w:after="60" w:line="276" w:lineRule="auto"/>
         <w:ind/>
-        <w:rPr/>
+        <w:rPr>
+          <w:highlight w:val="green"/>
+        </w:rPr>
       </w:pPr>
       <w:r>
         <w:rPr>
           <w:b/>
+          <w:highlight w:val="green"/>
         </w:rPr>
         <w:t xml:space="preserve">Документация:</w:t>
       </w:r>
       <w:r>
+        <w:rPr>
+          <w:highlight w:val="green"/>
+        </w:rPr>
         <w:t xml:space="preserve"> Интеграция Swagger или Scalar для интерактивной документации к API.</w:t>
       </w:r>
-      <w:r/>
+      <w:r>
+        <w:rPr>
+          <w:highlight w:val="green"/>
+        </w:rPr>
+      </w:r>
     </w:p>
     <w:p>
       <w:pPr>

</xml_diff>

<commit_message>
CREATE: vue index page, anon link logic, copy and qr, login
</commit_message>
<xml_diff>
--- a/tz_url_shortener.docx
+++ b/tz_url_shortener.docx
@@ -1412,18 +1412,28 @@
         <w:pBdr/>
         <w:spacing w:after="60" w:line="276" w:lineRule="auto"/>
         <w:ind/>
-        <w:rPr/>
+        <w:rPr>
+          <w:highlight w:val="green"/>
+        </w:rPr>
       </w:pPr>
       <w:r>
         <w:rPr>
           <w:b/>
+          <w:highlight w:val="green"/>
         </w:rPr>
         <w:t xml:space="preserve">Фокус на тестировании:</w:t>
       </w:r>
       <w:r>
+        <w:rPr>
+          <w:highlight w:val="green"/>
+        </w:rPr>
         <w:t xml:space="preserve"> Покройте ключевые бизнес-сценарии (сокращение гостем, авторизация, редирект с паролем, сбор статистики) автоматическими тестами на Pest. 70-80% покрытия — идеальный маркер качественного кода.</w:t>
       </w:r>
-      <w:r/>
+      <w:r>
+        <w:rPr>
+          <w:highlight w:val="green"/>
+        </w:rPr>
+      </w:r>
     </w:p>
     <w:p>
       <w:pPr>
@@ -1431,18 +1441,28 @@
         <w:pBdr/>
         <w:spacing w:after="60" w:line="276" w:lineRule="auto"/>
         <w:ind/>
-        <w:rPr/>
+        <w:rPr>
+          <w:highlight w:val="green"/>
+        </w:rPr>
       </w:pPr>
       <w:r>
         <w:rPr>
           <w:b/>
+          <w:highlight w:val="green"/>
         </w:rPr>
         <w:t xml:space="preserve">Презентация проекта:</w:t>
       </w:r>
       <w:r>
+        <w:rPr>
+          <w:highlight w:val="green"/>
+        </w:rPr>
         <w:t xml:space="preserve"> Оформите README.md. Добавьте архитектурную схему, скриншоты интерфейса и четкую инструкцию по запуску через `docker-compose up`. Половина работодателей оценивает проект по качеству его документации.</w:t>
       </w:r>
-      <w:r/>
+      <w:r>
+        <w:rPr>
+          <w:highlight w:val="green"/>
+        </w:rPr>
+      </w:r>
     </w:p>
     <w:sectPr>
       <w:footnotePr/>

</xml_diff>